<commit_message>
Replace misleading validation coverage figure with integrated outcomes
</commit_message>
<xml_diff>
--- a/docs/08_thesis_text/Integrated_Validation_Results_and_Discussion_Chapter.docx
+++ b/docs/08_thesis_text/Integrated_Validation_Results_and_Discussion_Chapter.docx
@@ -1502,12 +1502,13 @@
         <w:pStyle w:val="AcademicCaption"/>
       </w:pPr>
       <w:r>
-        <w:t>Figure 2. Recorded validation checks grouped by domain.</w:t>
+        <w:t>Figure 2. Integrated validation outcomes across security, storage, disaster recovery, and performance.</w:t>
       </w:r>
     </w:p>
     <w:p>
+      <w:pPr/>
       <w:r>
-        <w:t>The check counts are heterogeneous. A security check, a restored database row-count comparison, and the optimized performance scenario do not represent identical units of assurance. The total of 83 is therefore a coverage count, not a statistical score.</w:t>
+        <w:t>The domains are reported using outcome-specific measures rather than a direct comparison of check counts. The performance result consolidates concurrency, request volume, failure rate, throughput, and latency into one validated load scenario; it must not be interpreted as weaker merely because it occupies one line in the final validation matrix.</w:t>
       </w:r>
     </w:p>
     <w:p>

</xml_diff>